<commit_message>
Update role to Assistant Professor, fix author names, clean abstracts
- Change role to Assistant Professor across CV, bio (en/zh), experience pages
- Update research interests: Sustainable AI, Climate Policy, Low-Carbon Energy Transition, Resource and Environmental Economics
- Update self-introduction text with new research description
- Remove undergraduate education from website bio (kept in CV)
- Remove Talks menu from navigation and Featured Talks block from homepage
- Remove CICC intern from experience
- Fix publication author names: Ziheng Zhu, Shize Qin, Jessica Gordon, Shize Lu, Hanjie Mao
- Delete jrbl2021 (Financial Expo) publication
- Add (Chinese) marker to Chinese-language papers
- Clear made-up abstracts (accr2026, nexus2026, natenergy2026, ecm2025b, EnvPro2022_comparison, EnvPro2023_belt) - to be filled with real abstracts
- Sync zh abstracts with en (no translation, use real source text)
</commit_message>
<xml_diff>
--- a/static/files/yrx_cv.docx
+++ b/static/files/yrx_cv.docx
@@ -31,7 +31,7 @@
           <w:sz w:val="22"/>
           <w:szCs w:val="22"/>
         </w:rPr>
-        <w:t xml:space="preserve">Research Interests: Climate Change Policy Design and Evaluation; Sustainable Development of the Digital Economy; Low-Carbon Energy Transition</w:t>
+        <w:t xml:space="preserve">Research Interests: Sustainable AI, Climate Policy, Low-Carbon Energy Transition, Resource and Environmental Economics</w:t>
       </w:r>
     </w:p>
     <w:p>
@@ -121,7 +121,7 @@
           <w:sz w:val="22"/>
           <w:szCs w:val="22"/>
         </w:rPr>
-        <w:t xml:space="preserve">Assistant Researcher</w:t>
+        <w:t xml:space="preserve">Assistant Professor</w:t>
       </w:r>
     </w:p>
     <w:p>
@@ -821,7 +821,7 @@
           <w:sz w:val="22"/>
           <w:szCs w:val="22"/>
         </w:rPr>
-        <w:t xml:space="preserve">, 37(08): 80-95. (in Chinese)</w:t>
+        <w:t xml:space="preserve">, 37(08): 80-95. (Chinese)</w:t>
       </w:r>
     </w:p>
     <w:p>
@@ -867,7 +867,7 @@
           <w:sz w:val="22"/>
           <w:szCs w:val="22"/>
         </w:rPr>
-        <w:t xml:space="preserve">, 53(21): 35-42. (in Chinese)</w:t>
+        <w:t xml:space="preserve">, 53(21): 35-42. (Chinese)</w:t>
       </w:r>
     </w:p>
     <w:p>
@@ -913,7 +913,7 @@
           <w:sz w:val="22"/>
           <w:szCs w:val="22"/>
         </w:rPr>
-        <w:t xml:space="preserve">, 52(13): 68-73. (in Chinese)</w:t>
+        <w:t xml:space="preserve">, 52(13): 68-73. (Chinese)</w:t>
       </w:r>
     </w:p>
     <w:p>
@@ -967,7 +967,7 @@
           <w:sz w:val="22"/>
           <w:szCs w:val="22"/>
         </w:rPr>
-        <w:t xml:space="preserve">, 50(22): 16-20. (in Chinese)</w:t>
+        <w:t xml:space="preserve">, 50(22): 16-20. (Chinese)</w:t>
       </w:r>
     </w:p>
     <w:p>
@@ -1021,7 +1021,7 @@
           <w:sz w:val="22"/>
           <w:szCs w:val="22"/>
         </w:rPr>
-        <w:t xml:space="preserve">, 51(24): 72-76. (in Chinese)</w:t>
+        <w:t xml:space="preserve">, 51(24): 72-76. (Chinese)</w:t>
       </w:r>
     </w:p>
     <w:p>
@@ -1036,6 +1036,14 @@
       <w:r>
         <w:rPr>
           <w:rFonts w:ascii="Times New Roman" w:cs="Times New Roman" w:eastAsia="Times New Roman" w:hAnsi="Times New Roman"/>
+          <w:sz w:val="22"/>
+          <w:szCs w:val="22"/>
+        </w:rPr>
+        <w:t xml:space="preserve">Zhang, S., Chen, H., Wang, B., </w:t>
+      </w:r>
+      <w:r>
+        <w:rPr>
+          <w:rFonts w:ascii="Times New Roman" w:cs="Times New Roman" w:eastAsia="Times New Roman" w:hAnsi="Times New Roman"/>
           <w:b/>
           <w:bCs/>
           <w:sz w:val="22"/>
@@ -1049,60 +1057,6 @@
           <w:sz w:val="22"/>
           <w:szCs w:val="22"/>
         </w:rPr>
-        <w:t xml:space="preserve">, Zhang, D., Liu, Y., Li, Z., Zhang, D., 2021. Building Distinctive Paid Allocation Mechanisms to Leverage the Emission Reduction Role of Carbon Markets. </w:t>
-      </w:r>
-      <w:r>
-        <w:rPr>
-          <w:rFonts w:ascii="Times New Roman" w:cs="Times New Roman" w:eastAsia="Times New Roman" w:hAnsi="Times New Roman"/>
-          <w:i/>
-          <w:iCs/>
-          <w:sz w:val="22"/>
-          <w:szCs w:val="22"/>
-        </w:rPr>
-        <w:t xml:space="preserve">Financial Expo</w:t>
-      </w:r>
-      <w:r>
-        <w:rPr>
-          <w:rFonts w:ascii="Times New Roman" w:cs="Times New Roman" w:eastAsia="Times New Roman" w:hAnsi="Times New Roman"/>
-          <w:sz w:val="22"/>
-          <w:szCs w:val="22"/>
-        </w:rPr>
-        <w:t xml:space="preserve">. (in Chinese)</w:t>
-      </w:r>
-    </w:p>
-    <w:p>
-      <w:pPr>
-        <w:pStyle w:val="ListParagraph"/>
-        <w:numPr>
-          <w:ilvl w:val="0"/>
-          <w:numId w:val="2"/>
-        </w:numPr>
-        <w:spacing w:after="60"/>
-      </w:pPr>
-      <w:r>
-        <w:rPr>
-          <w:rFonts w:ascii="Times New Roman" w:cs="Times New Roman" w:eastAsia="Times New Roman" w:hAnsi="Times New Roman"/>
-          <w:sz w:val="22"/>
-          <w:szCs w:val="22"/>
-        </w:rPr>
-        <w:t xml:space="preserve">Zhang, S., Chen, H., Wang, B., </w:t>
-      </w:r>
-      <w:r>
-        <w:rPr>
-          <w:rFonts w:ascii="Times New Roman" w:cs="Times New Roman" w:eastAsia="Times New Roman" w:hAnsi="Times New Roman"/>
-          <w:b/>
-          <w:bCs/>
-          <w:sz w:val="22"/>
-          <w:szCs w:val="22"/>
-        </w:rPr>
-        <w:t xml:space="preserve">Yu, R.</w:t>
-      </w:r>
-      <w:r>
-        <w:rPr>
-          <w:rFonts w:ascii="Times New Roman" w:cs="Times New Roman" w:eastAsia="Times New Roman" w:hAnsi="Times New Roman"/>
-          <w:sz w:val="22"/>
-          <w:szCs w:val="22"/>
-        </w:rPr>
         <w:t xml:space="preserve">, Ma, Z., Miao, Y., 2023. Carbon emission monitoring based on the electricity-carbon relationship of cement enterprises. </w:t>
       </w:r>
       <w:r>
@@ -1121,7 +1075,7 @@
           <w:sz w:val="22"/>
           <w:szCs w:val="22"/>
         </w:rPr>
-        <w:t xml:space="preserve">, 43(07): 3787-3795. (in Chinese)</w:t>
+        <w:t xml:space="preserve">, 43(07): 3787-3795. (Chinese)</w:t>
       </w:r>
     </w:p>
     <w:p>

</xml_diff>

<commit_message>
Update CV: remove Skills section
</commit_message>
<xml_diff>
--- a/static/files/yrx_cv.docx
+++ b/static/files/yrx_cv.docx
@@ -413,7 +413,7 @@
           <w:sz w:val="22"/>
           <w:szCs w:val="22"/>
         </w:rPr>
-        <w:t xml:space="preserve">.</w:t>
+        <w:t xml:space="preserve">, Available online March 2026.</w:t>
       </w:r>
     </w:p>
     <w:p>
@@ -2265,39 +2265,6 @@
           <w:szCs w:val="22"/>
         </w:rPr>
         <w:t xml:space="preserve">Chinese (native), English (fluent)</w:t>
-      </w:r>
-    </w:p>
-    <w:p>
-      <w:pPr>
-        <w:pBdr>
-          <w:bottom w:val="single" w:color="000000" w:sz="6" w:space="1"/>
-        </w:pBdr>
-        <w:spacing w:after="120" w:before="200"/>
-      </w:pPr>
-      <w:r>
-        <w:rPr>
-          <w:rFonts w:ascii="Times New Roman" w:cs="Times New Roman" w:eastAsia="Times New Roman" w:hAnsi="Times New Roman"/>
-          <w:b/>
-          <w:bCs/>
-          <w:i/>
-          <w:iCs/>
-          <w:sz w:val="26"/>
-          <w:szCs w:val="26"/>
-        </w:rPr>
-        <w:t xml:space="preserve">Skills</w:t>
-      </w:r>
-    </w:p>
-    <w:p>
-      <w:pPr>
-        <w:spacing w:after="60"/>
-      </w:pPr>
-      <w:r>
-        <w:rPr>
-          <w:rFonts w:ascii="Times New Roman" w:cs="Times New Roman" w:eastAsia="Times New Roman" w:hAnsi="Times New Roman"/>
-          <w:sz w:val="22"/>
-          <w:szCs w:val="22"/>
-        </w:rPr>
-        <w:t xml:space="preserve">Microsoft Office Suite, Stata, Python, R</w:t>
       </w:r>
     </w:p>
     <w:sectPr>

</xml_diff>